<commit_message>
Enrich resume with provided career highlights and case-study metrics
Promote Vistra, Compaq, Texas Built, ARIS, and Stanford Telecom wins into Selected Highlights, and add AWS/SCADA emissions-platform results, biodiesel throughput/energy metrics, and cloud-modernization leadership from the IP notes.

Co-authored-by: tymarler <tymarler@users.noreply.github.com>
</commit_message>
<xml_diff>
--- a/resume/Anthony_Ty_Marler_Resume.docx
+++ b/resume/Anthony_Ty_Marler_Resume.docx
@@ -50,7 +50,7 @@
           <w:color w:val="1F3A5F"/>
           <w:sz w:val="21"/>
         </w:rPr>
-        <w:t>Senior Application Architect  ·  Inventor  ·  Energy &amp; Manufacturing Systems</w:t>
+        <w:t>Senior Application Architect  ·  Inventor  ·  Energy, Climate-Tech &amp; Manufacturing Systems</w:t>
       </w:r>
     </w:p>
     <w:p>
@@ -84,7 +84,7 @@
           <w:color w:val="222222"/>
           <w:sz w:val="20"/>
         </w:rPr>
-        <w:t>Senior application architect and hands-on technical leader who invents, designs, and operates systems that cut cost and create measurable profit. Named inventor on two issued U.S. patents. Recent work covers AWS cloud, .NET, SQL, OSIsoft PI, SharePoint, Chef, and the Fossil Generation application portfolio for mining, emissions, safety, and mobility. Combines architecture, TCO analysis, and root-cause troubleshooting with the ability to lead day-to-day delivery across cross-functional teams.</w:t>
+        <w:t>Results-oriented technical strategist and application architect who builds mission-critical software and data-driven systems for operational efficiency, regulatory compliance, and business outcomes. Named inventor on two issued U.S. patents. Combines AWS cloud, .NET, SQL, and systems integration with deep expertise in energy, mining, manufacturing, and environmental systems, and leads cross-functional teams through the full project lifecycle.</w:t>
       </w:r>
     </w:p>
     <w:p>
@@ -120,7 +120,7 @@
           <w:color w:val="222222"/>
           <w:sz w:val="20"/>
         </w:rPr>
-        <w:t>Designed a cloud-based emissions platform that normalized data from diverse systems to support credit trading, contributing $60 million in profit in the first two months.</w:t>
+        <w:t>Vistra — Designed a data-driven process engine for dynamic tasks; mine planning and monitoring software that measures productivity by shift; and a cloud emissions platform that unified diverse systems for credit trading, accounting for $60 million in profit in the first two months.</w:t>
       </w:r>
     </w:p>
     <w:p>
@@ -137,7 +137,7 @@
           <w:color w:val="222222"/>
           <w:sz w:val="20"/>
         </w:rPr>
-        <w:t>Invented a patented Compaq software-delivery architecture that eliminated more than 70% of computer manufacturing time.</w:t>
+        <w:t>Compaq — Invented and developed a patented software-delivery system that eliminated more than 70% of computer manufacturing time, plus a post-sales configuration method that increased inventory flexibility.</w:t>
       </w:r>
     </w:p>
     <w:p>
@@ -154,7 +154,7 @@
           <w:color w:val="222222"/>
           <w:sz w:val="20"/>
         </w:rPr>
-        <w:t>Invented a process-intensified biodiesel method that reduced reaction time from 4 hours to 4 minutes.</w:t>
+        <w:t>Texas Built Biofuels — Invented a process-intensified biodiesel method that reduced reaction time from 4 hours to 4 minutes (60x throughput; ~40% lower energy cost per gallon; ASTM-quality fuel).</w:t>
       </w:r>
     </w:p>
     <w:p>
@@ -171,7 +171,24 @@
           <w:color w:val="222222"/>
           <w:sz w:val="20"/>
         </w:rPr>
-        <w:t>Led architecture, operations, and RCA for the Luminant/Vistra Fossil portfolio (MSHA, emissions, GIS, safety, mobility, PI, SharePoint, AWS/Chef).</w:t>
+        <w:t>Automated Response Information Systems — Designed and implemented a hardware-based voice-recognition system for hands-free data collection in harsh environments.</w:t>
+      </w:r>
+    </w:p>
+    <w:p>
+      <w:pPr>
+        <w:pStyle w:val="ListBullet"/>
+        <w:spacing w:before="10" w:after="20" w:line="252" w:lineRule="auto"/>
+        <w:ind w:left="360" w:hanging="216"/>
+      </w:pPr>
+      <w:r>
+        <w:rPr>
+          <w:rFonts w:ascii="Calibri" w:hAnsi="Calibri" w:eastAsia="Calibri" w:cs="Calibri"/>
+          <w:b w:val="0"/>
+          <w:i w:val="0"/>
+          <w:color w:val="222222"/>
+          <w:sz w:val="20"/>
+        </w:rPr>
+        <w:t>Stanford Telecommunications — Worked on a team that developed planning and control software for the defense communication satellite network.</w:t>
       </w:r>
     </w:p>
     <w:p>
@@ -205,7 +222,7 @@
           <w:color w:val="222222"/>
           <w:sz w:val="20"/>
         </w:rPr>
-        <w:t>Application Architecture  ·  Cloud Configuration &amp; Deployment (AWS, Chef)  ·  .NET / C# / SQL  ·  Project Leadership  ·  Root-Cause Analysis  ·  TCO Analysis  ·  Data Modeling &amp; Database Design  ·  BAM / Application Monitoring  ·  Emissions Compliance  ·  Mining Operations Software  ·  GIS  ·  SharePoint  ·  OSIsoft PI  ·  Tableau</w:t>
+        <w:t>Application Architecture  ·  Systems Integration  ·  AWS Cloud &amp; Chef  ·  .NET / C# / SQL  ·  Agile / Scrum  ·  Cross-Functional Leadership  ·  Root-Cause Analysis  ·  TCO Analysis  ·  Data Modeling &amp; Database Design  ·  Emissions Compliance &amp; Carbon Credit Trading  ·  Mining Operations Software  ·  GIS  ·  SharePoint  ·  OSIsoft PI  ·  Tableau</w:t>
       </w:r>
     </w:p>
     <w:p>
@@ -242,7 +259,7 @@
           <w:color w:val="1F3A5F"/>
           <w:sz w:val="22"/>
         </w:rPr>
-        <w:t>Vistra Corp.</w:t>
+        <w:t>Vistra Corporate Services Company</w:t>
       </w:r>
       <w:r>
         <w:rPr>
@@ -295,7 +312,7 @@
           <w:color w:val="222222"/>
           <w:sz w:val="20"/>
         </w:rPr>
-        <w:t>Designed and developed a data-driven process engine that managed dynamic operational tasks and automated steps through completion.</w:t>
+        <w:t>Designed and developed a data-driven process engine to manage dynamic tasks, providing automated steps to drive the process to completion.</w:t>
       </w:r>
     </w:p>
     <w:p>
@@ -329,7 +346,7 @@
           <w:color w:val="222222"/>
           <w:sz w:val="20"/>
         </w:rPr>
-        <w:t>Built a cloud emissions-credit platform that unified heterogeneous data sources and accounted for $60 million in profit in the first two months.</w:t>
+        <w:t>Designed and developed a cloud-based AWS platform that ingested SCADA, PLC, and third-party emissions data into a normalized database for credit trading; accounted for $60 million in profit in the first two months, cut trading latency from weeks to hours, and reduced compliance reporting time by 80%.</w:t>
       </w:r>
     </w:p>
     <w:p>
@@ -346,24 +363,7 @@
           <w:color w:val="222222"/>
           <w:sz w:val="20"/>
         </w:rPr>
-        <w:t>Led design and development of web applications supporting mining, fossil generation, battery, and solar operations.</w:t>
-      </w:r>
-    </w:p>
-    <w:p>
-      <w:pPr>
-        <w:pStyle w:val="ListBullet"/>
-        <w:spacing w:before="10" w:after="20" w:line="252" w:lineRule="auto"/>
-        <w:ind w:left="360" w:hanging="216"/>
-      </w:pPr>
-      <w:r>
-        <w:rPr>
-          <w:rFonts w:ascii="Calibri" w:hAnsi="Calibri" w:eastAsia="Calibri" w:cs="Calibri"/>
-          <w:b w:val="0"/>
-          <w:i w:val="0"/>
-          <w:color w:val="222222"/>
-          <w:sz w:val="20"/>
-        </w:rPr>
-        <w:t>Delivered architectural solutions, TCO analysis, and SME support for mining operations, mining software, data modeling, and database design.</w:t>
+        <w:t>Led web applications supporting mining, fossil generation, battery, and solar operations, including Tableau dashboards for traders and compliance officers.</w:t>
       </w:r>
     </w:p>
     <w:p>
@@ -451,7 +451,7 @@
           <w:color w:val="222222"/>
           <w:sz w:val="20"/>
         </w:rPr>
-        <w:t>Directed development efforts across AWS Cloud, Chef, .NET, C#, C++, PHP, SQL Server, MySQL, Tableau, Formotus, TDMobile, StackVision, and NetDAHS.</w:t>
+        <w:t>Directed development across AWS, Chef, .NET, C#, C++, PHP, SQL Server, MySQL, Tableau, Formotus, TDMobile, StackVision, and NetDAHS.</w:t>
       </w:r>
     </w:p>
     <w:p>
@@ -485,7 +485,7 @@
           <w:color w:val="222222"/>
           <w:sz w:val="20"/>
         </w:rPr>
-        <w:t>Drove cloud configuration and Chef-based deployment, plus BAM application monitoring, to improve reliability and reduce operational risk.</w:t>
+        <w:t>Led a cloud modernization initiative that aligned DevOps, QA, and engineering (Agile ceremonies, shared dashboards); delivered three weeks ahead of schedule. Mentored engineers on AWS and Chef until a junior developer became a lead contributor within six months.</w:t>
       </w:r>
     </w:p>
     <w:p>
@@ -590,24 +590,7 @@
           <w:color w:val="222222"/>
           <w:sz w:val="20"/>
         </w:rPr>
-        <w:t>Served as SME for mining operations, mining software systems, data modeling, and database design; led development, troubleshooting, and RCA for complex application issues.</w:t>
-      </w:r>
-    </w:p>
-    <w:p>
-      <w:pPr>
-        <w:pStyle w:val="ListBullet"/>
-        <w:spacing w:before="10" w:after="20" w:line="252" w:lineRule="auto"/>
-        <w:ind w:left="360" w:hanging="216"/>
-      </w:pPr>
-      <w:r>
-        <w:rPr>
-          <w:rFonts w:ascii="Calibri" w:hAnsi="Calibri" w:eastAsia="Calibri" w:cs="Calibri"/>
-          <w:b w:val="0"/>
-          <w:i w:val="0"/>
-          <w:color w:val="222222"/>
-          <w:sz w:val="20"/>
-        </w:rPr>
-        <w:t>Introduced mobility (Formotus, TDMobile), OSIsoft PI integration, land-management solutions, and application-monitoring practices that later scaled under Accenture and Vistra.</w:t>
+        <w:t>Served as SME for mining operations, mining software systems, data modeling, and database design; introduced mobility (Formotus, TDMobile), OSIsoft PI, land management, and application monitoring.</w:t>
       </w:r>
     </w:p>
     <w:p>
@@ -690,7 +673,7 @@
           <w:color w:val="222222"/>
           <w:sz w:val="20"/>
         </w:rPr>
-        <w:t>Invented a method to speed biodiesel production that reduced reaction time from four hours to four minutes. Built and operated process-intensified reactor technology (patent pending: Texas Built process intensified biofuels reactor technologies).</w:t>
+        <w:t>Invented a process-intensified biodiesel reactor that reduced reaction time from four hours to four minutes, enabling continuous rather than batch production, about 60x throughput in the same footprint, and roughly 40% lower energy cost per gallon while maintaining ASTM fuel quality. Patent pending: Texas Built process intensified biofuels reactor technologies.</w:t>
       </w:r>
     </w:p>
     <w:p>
@@ -808,7 +791,7 @@
           <w:color w:val="222222"/>
           <w:sz w:val="20"/>
         </w:rPr>
-        <w:t>Invented and developed a patented software-delivery system that eliminated more than 70% of computer manufacturing time. Invented a post-sales configuration method that increased inventory flexibility. Named inventor on U.S. Patents 6,202,070 and 5,974,567.</w:t>
+        <w:t>Invented and developed a patented software-delivery system that eliminated more than 70% of the manufacture time of their computers. Also invented a post-sales configuration method that increased inventory flexibility. Named inventor on U.S. Patents 6,202,070 and 5,974,567.</w:t>
       </w:r>
     </w:p>
     <w:p>
@@ -916,7 +899,7 @@
           <w:color w:val="222222"/>
           <w:sz w:val="20"/>
         </w:rPr>
-        <w:t>Developed planning and control software for the defense communication satellite network.</w:t>
+        <w:t>Worked on a team to develop planning and control software for the defense communication satellite network.</w:t>
       </w:r>
     </w:p>
     <w:p>
@@ -1163,7 +1146,7 @@
           <w:color w:val="222222"/>
           <w:sz w:val="20"/>
         </w:rPr>
-        <w:t>AWS, Amazon RDS, Chef, OSIsoft PI, MS SQL Server, MySQL, Oracle, DB2, Tableau, BAM application monitoring, StackVision, NetDAHS</w:t>
+        <w:t>AWS, Amazon RDS, Chef, APIs, OSIsoft PI, MS SQL Server, MySQL, Oracle, DB2, Tableau, SCADA/PLC integration, BAM application monitoring, StackVision, NetDAHS</w:t>
       </w:r>
     </w:p>
     <w:p>
@@ -1213,7 +1196,7 @@
           <w:color w:val="222222"/>
           <w:sz w:val="20"/>
         </w:rPr>
-        <w:t>Fossil generation, mining operations, emissions compliance and credit trading, MSHA training, behavior-based safety, land management, mobility, digital signage, computer manufacturing software delivery</w:t>
+        <w:t>Fossil generation, mining operations, emissions compliance and carbon credit trading, MSHA training, behavior-based safety, land management, mobility, digital signage, computer manufacturing software delivery, biofuels process intensification</w:t>
       </w:r>
     </w:p>
     <w:p>

</xml_diff>

<commit_message>
Add AI-assisted architecture experience to the resume
Surface Cursor, Claude, and ChatGPT as current practice: independent role since Mar 2025, a selected highlight, core competency, and skills line. Frame 1990s voice recognition as early applied AI. Do not claim production ML that was not in the source materials.

Co-authored-by: tymarler <tymarler@users.noreply.github.com>
</commit_message>
<xml_diff>
--- a/resume/Anthony_Ty_Marler_Resume.docx
+++ b/resume/Anthony_Ty_Marler_Resume.docx
@@ -50,7 +50,7 @@
           <w:color w:val="1F3A5F"/>
           <w:sz w:val="21"/>
         </w:rPr>
-        <w:t>Senior Application Architect  ·  Inventor  ·  Energy, Climate-Tech &amp; Manufacturing Systems</w:t>
+        <w:t>Senior Application Architect  ·  Inventor  ·  Energy, Climate-Tech &amp; AI-Assisted Systems</w:t>
       </w:r>
     </w:p>
     <w:p>
@@ -84,7 +84,7 @@
           <w:color w:val="222222"/>
           <w:sz w:val="20"/>
         </w:rPr>
-        <w:t>Results-oriented technical strategist and application architect who builds mission-critical software and data-driven systems for operational efficiency, regulatory compliance, and business outcomes. Named inventor on two issued U.S. patents. Combines AWS cloud, .NET, SQL, and systems integration with deep expertise in energy, mining, manufacturing, and environmental systems, and leads cross-functional teams through the full project lifecycle.</w:t>
+        <w:t>Results-oriented technical strategist and application architect who builds mission-critical software and data-driven systems for operational efficiency, regulatory compliance, and business outcomes. Named inventor on two issued U.S. patents. Combines AWS cloud, .NET, SQL, and systems integration with generative AI (Cursor, Claude, ChatGPT) and deep expertise in energy, mining, manufacturing, and environmental systems. Leads cross-functional teams through the full project lifecycle.</w:t>
       </w:r>
     </w:p>
     <w:p>
@@ -104,6 +104,23 @@
           <w:sz w:val="22"/>
         </w:rPr>
         <w:t>SELECTED HIGHLIGHTS</w:t>
+      </w:r>
+    </w:p>
+    <w:p>
+      <w:pPr>
+        <w:pStyle w:val="ListBullet"/>
+        <w:spacing w:before="10" w:after="20" w:line="252" w:lineRule="auto"/>
+        <w:ind w:left="360" w:hanging="216"/>
+      </w:pPr>
+      <w:r>
+        <w:rPr>
+          <w:rFonts w:ascii="Calibri" w:hAnsi="Calibri" w:eastAsia="Calibri" w:cs="Calibri"/>
+          <w:b w:val="0"/>
+          <w:i w:val="0"/>
+          <w:color w:val="222222"/>
+          <w:sz w:val="20"/>
+        </w:rPr>
+        <w:t>AI-assisted architecture — Apply Cursor, Claude, and ChatGPT to design, code, document, and troubleshoot energy and industrial systems, pairing LLM workflows with architectural ownership and domain validation.</w:t>
       </w:r>
     </w:p>
     <w:p>
@@ -171,24 +188,7 @@
           <w:color w:val="222222"/>
           <w:sz w:val="20"/>
         </w:rPr>
-        <w:t>Automated Response Information Systems — Designed and implemented a hardware-based voice-recognition system for hands-free data collection in harsh environments.</w:t>
-      </w:r>
-    </w:p>
-    <w:p>
-      <w:pPr>
-        <w:pStyle w:val="ListBullet"/>
-        <w:spacing w:before="10" w:after="20" w:line="252" w:lineRule="auto"/>
-        <w:ind w:left="360" w:hanging="216"/>
-      </w:pPr>
-      <w:r>
-        <w:rPr>
-          <w:rFonts w:ascii="Calibri" w:hAnsi="Calibri" w:eastAsia="Calibri" w:cs="Calibri"/>
-          <w:b w:val="0"/>
-          <w:i w:val="0"/>
-          <w:color w:val="222222"/>
-          <w:sz w:val="20"/>
-        </w:rPr>
-        <w:t>Stanford Telecommunications — Worked on a team that developed planning and control software for the defense communication satellite network.</w:t>
+        <w:t>Automated Response Information Systems — Designed and implemented a hardware-based voice-recognition system for hands-free data collection in harsh environments (early applied AI / speech recognition).</w:t>
       </w:r>
     </w:p>
     <w:p>
@@ -222,7 +222,7 @@
           <w:color w:val="222222"/>
           <w:sz w:val="20"/>
         </w:rPr>
-        <w:t>Application Architecture  ·  Systems Integration  ·  AWS Cloud &amp; Chef  ·  .NET / C# / SQL  ·  Agile / Scrum  ·  Cross-Functional Leadership  ·  Root-Cause Analysis  ·  TCO Analysis  ·  Data Modeling &amp; Database Design  ·  Emissions Compliance &amp; Carbon Credit Trading  ·  Mining Operations Software  ·  GIS  ·  SharePoint  ·  OSIsoft PI  ·  Tableau</w:t>
+        <w:t>Application Architecture  ·  Generative AI (Cursor, Claude, ChatGPT)  ·  Systems Integration  ·  AWS Cloud &amp; Chef  ·  .NET / C# / SQL  ·  Agile / Scrum  ·  Cross-Functional Leadership  ·  Root-Cause Analysis  ·  TCO Analysis  ·  Data Modeling &amp; Database Design  ·  Emissions Compliance &amp; Carbon Credit Trading  ·  Mining Operations Software  ·  GIS  ·  SharePoint  ·  OSIsoft PI  ·  Tableau</w:t>
       </w:r>
     </w:p>
     <w:p>
@@ -242,6 +242,94 @@
           <w:sz w:val="22"/>
         </w:rPr>
         <w:t>PROFESSIONAL EXPERIENCE</w:t>
+      </w:r>
+    </w:p>
+    <w:p>
+      <w:pPr>
+        <w:spacing w:before="120" w:after="0" w:line="252" w:lineRule="auto"/>
+        <w:tabs>
+          <w:tab w:val="right" w:pos="10368"/>
+        </w:tabs>
+      </w:pPr>
+      <w:r>
+        <w:rPr>
+          <w:rFonts w:ascii="Calibri" w:hAnsi="Calibri" w:eastAsia="Calibri" w:cs="Calibri"/>
+          <w:b/>
+          <w:i w:val="0"/>
+          <w:color w:val="1F3A5F"/>
+          <w:sz w:val="22"/>
+        </w:rPr>
+        <w:t>Independent</w:t>
+      </w:r>
+      <w:r>
+        <w:rPr>
+          <w:rFonts w:ascii="Calibri" w:hAnsi="Calibri" w:eastAsia="Calibri" w:cs="Calibri"/>
+          <w:b w:val="0"/>
+          <w:i w:val="0"/>
+          <w:color w:val="4A4A4A"/>
+          <w:sz w:val="20"/>
+        </w:rPr>
+        <w:t xml:space="preserve">  |  Texas</w:t>
+      </w:r>
+      <w:r>
+        <w:rPr>
+          <w:rFonts w:ascii="Calibri" w:hAnsi="Calibri" w:eastAsia="Calibri" w:cs="Calibri"/>
+          <w:b w:val="0"/>
+          <w:i/>
+          <w:color w:val="4A4A4A"/>
+          <w:sz w:val="20"/>
+        </w:rPr>
+        <w:tab/>
+        <w:t>Mar 2025 – Present</w:t>
+      </w:r>
+    </w:p>
+    <w:p>
+      <w:pPr>
+        <w:spacing w:before="0" w:after="40" w:line="252" w:lineRule="auto"/>
+      </w:pPr>
+      <w:r>
+        <w:rPr>
+          <w:rFonts w:ascii="Calibri" w:hAnsi="Calibri" w:eastAsia="Calibri" w:cs="Calibri"/>
+          <w:b/>
+          <w:i/>
+          <w:color w:val="222222"/>
+          <w:sz w:val="21"/>
+        </w:rPr>
+        <w:t>Application Architect, AI-Assisted Systems</w:t>
+      </w:r>
+    </w:p>
+    <w:p>
+      <w:pPr>
+        <w:pStyle w:val="ListBullet"/>
+        <w:spacing w:before="10" w:after="20" w:line="252" w:lineRule="auto"/>
+        <w:ind w:left="360" w:hanging="216"/>
+      </w:pPr>
+      <w:r>
+        <w:rPr>
+          <w:rFonts w:ascii="Calibri" w:hAnsi="Calibri" w:eastAsia="Calibri" w:cs="Calibri"/>
+          <w:b w:val="0"/>
+          <w:i w:val="0"/>
+          <w:color w:val="222222"/>
+          <w:sz w:val="20"/>
+        </w:rPr>
+        <w:t>Apply Cursor, Claude, and ChatGPT across architecture, coding, root-cause analysis, and documentation to accelerate delivery while retaining design ownership and domain review.</w:t>
+      </w:r>
+    </w:p>
+    <w:p>
+      <w:pPr>
+        <w:pStyle w:val="ListBullet"/>
+        <w:spacing w:before="10" w:after="20" w:line="252" w:lineRule="auto"/>
+        <w:ind w:left="360" w:hanging="216"/>
+      </w:pPr>
+      <w:r>
+        <w:rPr>
+          <w:rFonts w:ascii="Calibri" w:hAnsi="Calibri" w:eastAsia="Calibri" w:cs="Calibri"/>
+          <w:b w:val="0"/>
+          <w:i w:val="0"/>
+          <w:color w:val="222222"/>
+          <w:sz w:val="20"/>
+        </w:rPr>
+        <w:t>Use AI-assisted development to prototype and refine cloud and application solutions (AWS, .NET, SQL) for energy, climate-tech, and industrial operations.</w:t>
       </w:r>
     </w:p>
     <w:p>
@@ -485,7 +573,7 @@
           <w:color w:val="222222"/>
           <w:sz w:val="20"/>
         </w:rPr>
-        <w:t>Led a cloud modernization initiative that aligned DevOps, QA, and engineering (Agile ceremonies, shared dashboards); delivered three weeks ahead of schedule. Mentored engineers on AWS and Chef until a junior developer became a lead contributor within six months.</w:t>
+        <w:t>Led a cloud modernization that aligned DevOps, QA, and engineering and delivered three weeks ahead of schedule. Mentored engineers on AWS and Chef; a junior developer became a lead contributor within six months.</w:t>
       </w:r>
     </w:p>
     <w:p>
@@ -845,7 +933,7 @@
           <w:color w:val="222222"/>
           <w:sz w:val="20"/>
         </w:rPr>
-        <w:t>Designed and implemented a hardware-based voice-recognition system for hands-free data collection in harsh environments.</w:t>
+        <w:t>Designed and implemented a hardware-based voice-recognition system for hands-free data collection in harsh environments (early applied AI / speech recognition).</w:t>
       </w:r>
     </w:p>
     <w:p>
@@ -1111,6 +1199,31 @@
           <w:color w:val="1F3A5F"/>
           <w:sz w:val="20"/>
         </w:rPr>
+        <w:t xml:space="preserve">AI &amp; developer tools:  </w:t>
+      </w:r>
+      <w:r>
+        <w:rPr>
+          <w:rFonts w:ascii="Calibri" w:hAnsi="Calibri" w:eastAsia="Calibri" w:cs="Calibri"/>
+          <w:b w:val="0"/>
+          <w:i w:val="0"/>
+          <w:color w:val="222222"/>
+          <w:sz w:val="20"/>
+        </w:rPr>
+        <w:t>Cursor, Claude, ChatGPT; AI-assisted architecture, coding, RCA, and documentation</w:t>
+      </w:r>
+    </w:p>
+    <w:p>
+      <w:pPr>
+        <w:spacing w:before="20" w:after="20" w:line="259" w:lineRule="auto"/>
+      </w:pPr>
+      <w:r>
+        <w:rPr>
+          <w:rFonts w:ascii="Calibri" w:hAnsi="Calibri" w:eastAsia="Calibri" w:cs="Calibri"/>
+          <w:b/>
+          <w:i w:val="0"/>
+          <w:color w:val="1F3A5F"/>
+          <w:sz w:val="20"/>
+        </w:rPr>
         <w:t xml:space="preserve">Languages &amp; platforms:  </w:t>
       </w:r>
       <w:r>
@@ -1171,7 +1284,7 @@
           <w:color w:val="222222"/>
           <w:sz w:val="20"/>
         </w:rPr>
-        <w:t>Visual Studio, SharePoint, ESRI GIS, Formotus, TDMobile, Qdabra, SmartProcedures, Visio, MS Project, LabVIEW, Cursor, Claude, ChatGPT</w:t>
+        <w:t>Visual Studio, SharePoint, ESRI GIS, Formotus, TDMobile, Qdabra, SmartProcedures, Visio, MS Project, LabVIEW</w:t>
       </w:r>
     </w:p>
     <w:p>
@@ -1196,7 +1309,7 @@
           <w:color w:val="222222"/>
           <w:sz w:val="20"/>
         </w:rPr>
-        <w:t>Fossil generation, mining operations, emissions compliance and carbon credit trading, MSHA training, behavior-based safety, land management, mobility, digital signage, computer manufacturing software delivery, biofuels process intensification</w:t>
+        <w:t>Fossil generation, mining operations, emissions compliance and carbon credit trading, MSHA training, behavior-based safety, land management, mobility, digital signage, computer manufacturing software delivery, biofuels process intensification, AI-assisted industrial systems</w:t>
       </w:r>
     </w:p>
     <w:p>
@@ -1230,7 +1343,7 @@
           <w:color w:val="222222"/>
           <w:sz w:val="20"/>
         </w:rPr>
-        <w:t>Computer Science coursework and Certificate in Ada, Colorado Technical College. Advanced C++ and Advanced Java, Compaq Computer Corporation. DEC VAX/VMS System Management and System Performance Management. U.S. Army Basic Electronics, Strategic Microwave System Repair, and Cryptographic courses.</w:t>
+        <w:t>Computer Science coursework and Certificate in Ada, Colorado Technical College. Advanced C++ and Advanced Java, Compaq. DEC VAX/VMS System Management. U.S. Army Basic Electronics, Strategic Microwave System Repair, and Cryptographic courses.</w:t>
       </w:r>
     </w:p>
     <w:sectPr>

</xml_diff>

<commit_message>
Name four AI-built applications on the independent role
Add the fugitive-tracking app, architectural-planning site, clothing-brand retail site, and internet TV streaming application to highlights, Independent experience, domains, and the LinkedIn paste kit.

Co-authored-by: tymarler <tymarler@users.noreply.github.com>
</commit_message>
<xml_diff>
--- a/resume/Anthony_Ty_Marler_Resume.docx
+++ b/resume/Anthony_Ty_Marler_Resume.docx
@@ -120,7 +120,7 @@
           <w:color w:val="222222"/>
           <w:sz w:val="20"/>
         </w:rPr>
-        <w:t>AI-assisted architecture — Apply Cursor, Claude, and ChatGPT to design, code, document, and troubleshoot energy and industrial systems, pairing LLM workflows with architectural ownership and domain validation.</w:t>
+        <w:t>AI-built applications — Used Cursor, Claude, and ChatGPT to architect and develop an international fugitive-tracking application, a custom architectural-planning site, a clothing-brand retail site, and an internet television streaming application.</w:t>
       </w:r>
     </w:p>
     <w:p>
@@ -312,7 +312,7 @@
           <w:color w:val="222222"/>
           <w:sz w:val="20"/>
         </w:rPr>
-        <w:t>Apply Cursor, Claude, and ChatGPT across architecture, coding, root-cause analysis, and documentation to accelerate delivery while retaining design ownership and domain review.</w:t>
+        <w:t>Used Cursor, Claude, and ChatGPT to architect and develop an international fugitive-tracking application and a custom architectural-planning website.</w:t>
       </w:r>
     </w:p>
     <w:p>
@@ -329,7 +329,7 @@
           <w:color w:val="222222"/>
           <w:sz w:val="20"/>
         </w:rPr>
-        <w:t>Use AI-assisted development to prototype and refine cloud and application solutions (AWS, .NET, SQL) for energy, climate-tech, and industrial operations.</w:t>
+        <w:t>Delivered a clothing-brand retail / e-commerce site and an internet television streaming application with AI-assisted architecture, UI, and backend development.</w:t>
       </w:r>
     </w:p>
     <w:p>
@@ -1309,7 +1309,7 @@
           <w:color w:val="222222"/>
           <w:sz w:val="20"/>
         </w:rPr>
-        <w:t>Fossil generation, mining operations, emissions compliance and carbon credit trading, MSHA training, behavior-based safety, land management, mobility, digital signage, computer manufacturing software delivery, biofuels process intensification, AI-assisted industrial systems</w:t>
+        <w:t>Fossil generation, mining operations, emissions compliance and carbon credit trading, MSHA training, e-commerce, streaming media, architectural planning systems, investigative/tracking applications, biofuels process intensification, AI-assisted industrial systems</w:t>
       </w:r>
     </w:p>
     <w:p>

</xml_diff>

<commit_message>
Rebuild resume in strict reverse-chronological order
Lead summary, highlights, experience, patents, skills, and education with the most recent work. Drop the Additional Experience split so the timeline runs Independent (2025) through U.S. Army (1984) without jumping to 1990s highlights first.

Co-authored-by: tymarler <tymarler@users.noreply.github.com>
</commit_message>
<xml_diff>
--- a/resume/Anthony_Ty_Marler_Resume.docx
+++ b/resume/Anthony_Ty_Marler_Resume.docx
@@ -84,7 +84,7 @@
           <w:color w:val="222222"/>
           <w:sz w:val="20"/>
         </w:rPr>
-        <w:t>Results-oriented technical strategist and application architect who builds mission-critical software and data-driven systems for operational efficiency, regulatory compliance, and business outcomes. Named inventor on two issued U.S. patents. Combines AWS cloud, .NET, SQL, and systems integration with generative AI (Cursor, Claude, ChatGPT) and deep expertise in energy, mining, manufacturing, and environmental systems. Leads cross-functional teams through the full project lifecycle.</w:t>
+        <w:t>Application architect currently shipping AI-assisted products with Cursor, Claude, and ChatGPT, following five years at Vistra designing generation, mining, and emissions systems — including a cloud credit-trading platform that accounted for $60 million in profit in the first two months. Named inventor on two U.S. patents. Combines AWS, .NET, SQL, and systems integration with deep energy, mining, and manufacturing domain expertise, and leads cross-functional teams through the full project lifecycle.</w:t>
       </w:r>
     </w:p>
     <w:p>
@@ -120,7 +120,7 @@
           <w:color w:val="222222"/>
           <w:sz w:val="20"/>
         </w:rPr>
-        <w:t>AI-built applications — Used Cursor, Claude, and ChatGPT to architect and develop an international fugitive-tracking application, a custom architectural-planning site, a clothing-brand retail site, and an internet television streaming application.</w:t>
+        <w:t>Independent (2025–present) — Used Cursor, Claude, and ChatGPT to architect and develop an international fugitive-tracking application, a custom architectural-planning site, a clothing-brand retail site, and an internet television streaming application.</w:t>
       </w:r>
     </w:p>
     <w:p>
@@ -137,7 +137,7 @@
           <w:color w:val="222222"/>
           <w:sz w:val="20"/>
         </w:rPr>
-        <w:t>Vistra — Designed a data-driven process engine for dynamic tasks; mine planning and monitoring software that measures productivity by shift; and a cloud emissions platform that unified diverse systems for credit trading, accounting for $60 million in profit in the first two months.</w:t>
+        <w:t>Vistra (2019–2025) — Designed a data-driven process engine; mine planning software that measures productivity by shift; and a cloud emissions platform that unified diverse systems for credit trading ($60 million in the first two months).</w:t>
       </w:r>
     </w:p>
     <w:p>
@@ -154,7 +154,7 @@
           <w:color w:val="222222"/>
           <w:sz w:val="20"/>
         </w:rPr>
-        <w:t>Compaq — Invented and developed a patented software-delivery system that eliminated more than 70% of computer manufacturing time, plus a post-sales configuration method that increased inventory flexibility.</w:t>
+        <w:t>Accenture (2016–2019) — Led Fossil Applications operations for Luminant generation and mining; delivered a cloud modernization three weeks ahead of schedule.</w:t>
       </w:r>
     </w:p>
     <w:p>
@@ -171,7 +171,7 @@
           <w:color w:val="222222"/>
           <w:sz w:val="20"/>
         </w:rPr>
-        <w:t>Texas Built Biofuels — Invented a process-intensified biodiesel method that reduced reaction time from 4 hours to 4 minutes (60x throughput; ~40% lower energy cost per gallon; ASTM-quality fuel).</w:t>
+        <w:t>Capgemini (2008–2016) — Architected Fossil Generation applications spanning MSHA training, emissions compliance, GIS, safety, mobility, PI, and SharePoint.</w:t>
       </w:r>
     </w:p>
     <w:p>
@@ -188,7 +188,7 @@
           <w:color w:val="222222"/>
           <w:sz w:val="20"/>
         </w:rPr>
-        <w:t>Automated Response Information Systems — Designed and implemented a hardware-based voice-recognition system for hands-free data collection in harsh environments (early applied AI / speech recognition).</w:t>
+        <w:t>Texas Built (1998–2008) — Invented a process-intensified biodiesel method that reduced reaction time from 4 hours to 4 minutes (60x throughput; ~40% lower energy cost per gallon).</w:t>
       </w:r>
     </w:p>
     <w:p>
@@ -222,7 +222,7 @@
           <w:color w:val="222222"/>
           <w:sz w:val="20"/>
         </w:rPr>
-        <w:t>Application Architecture  ·  Generative AI (Cursor, Claude, ChatGPT)  ·  Systems Integration  ·  AWS Cloud &amp; Chef  ·  .NET / C# / SQL  ·  Agile / Scrum  ·  Cross-Functional Leadership  ·  Root-Cause Analysis  ·  TCO Analysis  ·  Data Modeling &amp; Database Design  ·  Emissions Compliance &amp; Carbon Credit Trading  ·  Mining Operations Software  ·  GIS  ·  SharePoint  ·  OSIsoft PI  ·  Tableau</w:t>
+        <w:t>Generative AI (Cursor, Claude, ChatGPT)  ·  Application Architecture  ·  Systems Integration  ·  AWS Cloud &amp; Chef  ·  .NET / C# / SQL  ·  Agile / Scrum  ·  Cross-Functional Leadership  ·  Root-Cause Analysis  ·  TCO Analysis  ·  Data Modeling &amp; Database Design  ·  Emissions Compliance &amp; Carbon Credit Trading  ·  Mining Operations Software  ·  GIS  ·  SharePoint  ·  OSIsoft PI  ·  Tableau</w:t>
       </w:r>
     </w:p>
     <w:p>
@@ -683,25 +683,6 @@
     </w:p>
     <w:p>
       <w:pPr>
-        <w:spacing w:before="160" w:after="60" w:line="240" w:lineRule="auto"/>
-        <w:jc w:val="left"/>
-        <w:pBdr>
-          <w:bottom w:val="single" w:sz="12" w:space="1" w:color="1F3A5F"/>
-        </w:pBdr>
-      </w:pPr>
-      <w:r>
-        <w:rPr>
-          <w:rFonts w:ascii="Calibri" w:hAnsi="Calibri" w:eastAsia="Calibri" w:cs="Calibri"/>
-          <w:b/>
-          <w:i w:val="0"/>
-          <w:color w:val="1F3A5F"/>
-          <w:sz w:val="22"/>
-        </w:rPr>
-        <w:t>ADDITIONAL EXPERIENCE</w:t>
-      </w:r>
-    </w:p>
-    <w:p>
-      <w:pPr>
         <w:spacing w:before="80" w:after="0" w:line="252" w:lineRule="auto"/>
         <w:tabs>
           <w:tab w:val="right" w:pos="10368"/>
@@ -1131,6 +1112,23 @@
           <w:color w:val="222222"/>
           <w:sz w:val="20"/>
         </w:rPr>
+        <w:t>Pending — Texas Built process intensified biofuels reactor technologies.</w:t>
+      </w:r>
+    </w:p>
+    <w:p>
+      <w:pPr>
+        <w:pStyle w:val="ListBullet"/>
+        <w:spacing w:before="10" w:after="20" w:line="252" w:lineRule="auto"/>
+        <w:ind w:left="360" w:hanging="216"/>
+      </w:pPr>
+      <w:r>
+        <w:rPr>
+          <w:rFonts w:ascii="Calibri" w:hAnsi="Calibri" w:eastAsia="Calibri" w:cs="Calibri"/>
+          <w:b w:val="0"/>
+          <w:i w:val="0"/>
+          <w:color w:val="222222"/>
+          <w:sz w:val="20"/>
+        </w:rPr>
         <w:t>U.S. 6,202,070 (2001) — Computer manufacturing system architecture with enhanced software distribution functions (Compaq; named inventor).</w:t>
       </w:r>
     </w:p>
@@ -1149,23 +1147,6 @@
           <w:sz w:val="20"/>
         </w:rPr>
         <w:t>U.S. 5,974,567 (1999) — Ghost partition / runtime-selectable file system (Compaq; named inventor).</w:t>
-      </w:r>
-    </w:p>
-    <w:p>
-      <w:pPr>
-        <w:pStyle w:val="ListBullet"/>
-        <w:spacing w:before="10" w:after="20" w:line="252" w:lineRule="auto"/>
-        <w:ind w:left="360" w:hanging="216"/>
-      </w:pPr>
-      <w:r>
-        <w:rPr>
-          <w:rFonts w:ascii="Calibri" w:hAnsi="Calibri" w:eastAsia="Calibri" w:cs="Calibri"/>
-          <w:b w:val="0"/>
-          <w:i w:val="0"/>
-          <w:color w:val="222222"/>
-          <w:sz w:val="20"/>
-        </w:rPr>
-        <w:t>Pending — Texas Built process intensified biofuels reactor technologies.</w:t>
       </w:r>
     </w:p>
     <w:p>
@@ -1224,7 +1205,7 @@
           <w:color w:val="1F3A5F"/>
           <w:sz w:val="20"/>
         </w:rPr>
-        <w:t xml:space="preserve">Languages &amp; platforms:  </w:t>
+        <w:t xml:space="preserve">Cloud, data &amp; monitoring:  </w:t>
       </w:r>
       <w:r>
         <w:rPr>
@@ -1234,7 +1215,7 @@
           <w:color w:val="222222"/>
           <w:sz w:val="20"/>
         </w:rPr>
-        <w:t>C# / .NET, VB.NET, C++ / C++.NET, C, PHP, Java, SQL, AJAX, Chef, Intel Assembly; prior: Ada, FORTRAN, BASIC, VMS/DCL, PRO*C, FOCUS, PAL, Silverlight</w:t>
+        <w:t>AWS, Amazon RDS, Chef, APIs, OSIsoft PI, MS SQL Server, MySQL, Oracle, DB2, Tableau, SCADA/PLC integration, BAM application monitoring, StackVision, NetDAHS</w:t>
       </w:r>
     </w:p>
     <w:p>
@@ -1249,7 +1230,7 @@
           <w:color w:val="1F3A5F"/>
           <w:sz w:val="20"/>
         </w:rPr>
-        <w:t xml:space="preserve">Cloud, data &amp; monitoring:  </w:t>
+        <w:t xml:space="preserve">Languages &amp; platforms:  </w:t>
       </w:r>
       <w:r>
         <w:rPr>
@@ -1259,7 +1240,7 @@
           <w:color w:val="222222"/>
           <w:sz w:val="20"/>
         </w:rPr>
-        <w:t>AWS, Amazon RDS, Chef, APIs, OSIsoft PI, MS SQL Server, MySQL, Oracle, DB2, Tableau, SCADA/PLC integration, BAM application monitoring, StackVision, NetDAHS</w:t>
+        <w:t>C# / .NET, VB.NET, C++ / C++.NET, C, PHP, Java, SQL, AJAX, Chef, Intel Assembly; prior: Ada, FORTRAN, BASIC, VMS/DCL, PRO*C, FOCUS, PAL, Silverlight</w:t>
       </w:r>
     </w:p>
     <w:p>
@@ -1309,7 +1290,7 @@
           <w:color w:val="222222"/>
           <w:sz w:val="20"/>
         </w:rPr>
-        <w:t>Fossil generation, mining operations, emissions compliance and carbon credit trading, MSHA training, e-commerce, streaming media, architectural planning systems, investigative/tracking applications, biofuels process intensification, AI-assisted industrial systems</w:t>
+        <w:t>AI-assisted applications, investigative/tracking systems, architectural planning, e-commerce, streaming media, fossil generation, mining operations, emissions compliance and carbon credit trading, MSHA training, biofuels process intensification</w:t>
       </w:r>
     </w:p>
     <w:p>
@@ -1343,7 +1324,7 @@
           <w:color w:val="222222"/>
           <w:sz w:val="20"/>
         </w:rPr>
-        <w:t>Computer Science coursework and Certificate in Ada, Colorado Technical College. Advanced C++ and Advanced Java, Compaq. DEC VAX/VMS System Management. U.S. Army Basic Electronics, Strategic Microwave System Repair, and Cryptographic courses.</w:t>
+        <w:t>Advanced C++ and Advanced Java, Compaq Computer Corporation. Computer Science coursework and Certificate in Ada, Colorado Technical College. DEC VAX/VMS System Management. U.S. Army Basic Electronics, Strategic Microwave System Repair, and Cryptographic courses.</w:t>
       </w:r>
     </w:p>
     <w:sectPr>

</xml_diff>